<commit_message>
Update VR trainer project and diploma materials
</commit_message>
<xml_diff>
--- a/ДипломФАА v2.0.docx
+++ b/ДипломФАА v2.0.docx
@@ -15,500 +15,6 @@
           <w:sz w:val="28"/>
           <w:szCs w:val="28"/>
         </w:rPr>
-        <w:t>Государственное бюджетное профессиональное образовательное учреждение «Южно-Уральский государственный колледж»</w:t>
-      </w:r>
-    </w:p>
-    <w:p>
-      <w:pPr>
-        <w:spacing w:before="480"/>
-        <w:jc w:val="center"/>
-        <w:rPr>
-          <w:sz w:val="28"/>
-          <w:szCs w:val="28"/>
-        </w:rPr>
-      </w:pPr>
-      <w:r>
-        <w:rPr>
-          <w:sz w:val="28"/>
-          <w:szCs w:val="28"/>
-        </w:rPr>
-        <w:t>Кафедра «Информатики и вычислительной техники»</w:t>
-      </w:r>
-    </w:p>
-    <w:p>
-      <w:pPr>
-        <w:spacing w:before="1440" w:line="360" w:lineRule="auto"/>
-        <w:ind w:firstLine="567"/>
-        <w:jc w:val="center"/>
-        <w:rPr>
-          <w:b/>
-          <w:sz w:val="28"/>
-          <w:szCs w:val="28"/>
-        </w:rPr>
-      </w:pPr>
-      <w:r>
-        <w:rPr>
-          <w:b/>
-          <w:sz w:val="28"/>
-          <w:szCs w:val="28"/>
-        </w:rPr>
-        <w:t>ДИПЛОМНЫЙ ПРОЕКТ</w:t>
-      </w:r>
-    </w:p>
-    <w:p>
-      <w:pPr>
-        <w:spacing w:line="360" w:lineRule="auto"/>
-        <w:ind w:firstLine="567"/>
-        <w:jc w:val="center"/>
-        <w:rPr>
-          <w:b/>
-          <w:sz w:val="28"/>
-          <w:szCs w:val="28"/>
-        </w:rPr>
-      </w:pPr>
-    </w:p>
-    <w:p>
-      <w:pPr>
-        <w:spacing w:line="360" w:lineRule="auto"/>
-        <w:jc w:val="center"/>
-        <w:rPr>
-          <w:sz w:val="28"/>
-          <w:szCs w:val="28"/>
-        </w:rPr>
-      </w:pPr>
-      <w:bookmarkStart w:id="0" w:name="_Hlk229942405"/>
-      <w:r>
-        <w:rPr>
-          <w:b/>
-          <w:bCs/>
-          <w:sz w:val="28"/>
-          <w:szCs w:val="28"/>
-        </w:rPr>
-        <w:t>Разработка обучающего VR-приложения</w:t>
-      </w:r>
-      <w:bookmarkEnd w:id="0"/>
-      <w:r>
-        <w:rPr>
-          <w:b/>
-          <w:bCs/>
-          <w:sz w:val="28"/>
-          <w:szCs w:val="28"/>
-        </w:rPr>
-        <w:br/>
-      </w:r>
-    </w:p>
-    <w:p>
-      <w:pPr>
-        <w:spacing w:after="720" w:line="360" w:lineRule="auto"/>
-        <w:jc w:val="center"/>
-        <w:rPr>
-          <w:sz w:val="28"/>
-          <w:szCs w:val="28"/>
-        </w:rPr>
-      </w:pPr>
-      <w:r>
-        <w:rPr>
-          <w:sz w:val="28"/>
-          <w:szCs w:val="28"/>
-        </w:rPr>
-        <w:t>специальность СПО 09.02.07 «Информационные системы и программирование»</w:t>
-      </w:r>
-    </w:p>
-    <w:tbl>
-      <w:tblPr>
-        <w:tblStyle w:val="ab"/>
-        <w:tblW w:w="9747" w:type="dxa"/>
-        <w:tblBorders>
-          <w:top w:val="none" w:sz="0" w:space="0" w:color="auto"/>
-          <w:left w:val="none" w:sz="0" w:space="0" w:color="auto"/>
-          <w:bottom w:val="none" w:sz="0" w:space="0" w:color="auto"/>
-          <w:right w:val="none" w:sz="0" w:space="0" w:color="auto"/>
-          <w:insideH w:val="none" w:sz="0" w:space="0" w:color="auto"/>
-          <w:insideV w:val="none" w:sz="0" w:space="0" w:color="auto"/>
-        </w:tblBorders>
-        <w:tblLook w:val="04A0" w:firstRow="1" w:lastRow="0" w:firstColumn="1" w:lastColumn="0" w:noHBand="0" w:noVBand="1"/>
-      </w:tblPr>
-      <w:tblGrid>
-        <w:gridCol w:w="5070"/>
-        <w:gridCol w:w="4677"/>
-      </w:tblGrid>
-      <w:tr>
-        <w:trPr>
-          <w:trHeight w:val="839"/>
-        </w:trPr>
-        <w:tc>
-          <w:tcPr>
-            <w:tcW w:w="5070" w:type="dxa"/>
-            <w:hideMark/>
-          </w:tcPr>
-          <w:p>
-            <w:pPr>
-              <w:spacing w:line="360" w:lineRule="auto"/>
-              <w:rPr>
-                <w:sz w:val="28"/>
-                <w:szCs w:val="28"/>
-              </w:rPr>
-            </w:pPr>
-            <w:r>
-              <w:rPr>
-                <w:sz w:val="28"/>
-                <w:szCs w:val="28"/>
-              </w:rPr>
-              <w:t>Курсовой проект выполнил:</w:t>
-            </w:r>
-          </w:p>
-          <w:p>
-            <w:pPr>
-              <w:spacing w:line="360" w:lineRule="auto"/>
-              <w:rPr>
-                <w:sz w:val="28"/>
-                <w:szCs w:val="28"/>
-              </w:rPr>
-            </w:pPr>
-            <w:r>
-              <w:rPr>
-                <w:sz w:val="28"/>
-                <w:szCs w:val="28"/>
-              </w:rPr>
-              <w:t>студент группы ИСп319ДК,</w:t>
-            </w:r>
-          </w:p>
-          <w:p>
-            <w:pPr>
-              <w:spacing w:line="360" w:lineRule="auto"/>
-              <w:rPr>
-                <w:sz w:val="28"/>
-                <w:szCs w:val="28"/>
-              </w:rPr>
-            </w:pPr>
-            <w:r>
-              <w:rPr>
-                <w:sz w:val="28"/>
-                <w:szCs w:val="28"/>
-              </w:rPr>
-              <w:t>очного отделения</w:t>
-            </w:r>
-          </w:p>
-        </w:tc>
-        <w:tc>
-          <w:tcPr>
-            <w:tcW w:w="4677" w:type="dxa"/>
-            <w:hideMark/>
-          </w:tcPr>
-          <w:p>
-            <w:pPr>
-              <w:spacing w:line="360" w:lineRule="auto"/>
-              <w:rPr>
-                <w:sz w:val="28"/>
-                <w:szCs w:val="28"/>
-              </w:rPr>
-            </w:pPr>
-            <w:r>
-              <w:rPr>
-                <w:sz w:val="28"/>
-                <w:szCs w:val="28"/>
-              </w:rPr>
-              <w:t>_________________Федин А.А</w:t>
-            </w:r>
-            <w:r>
-              <w:rPr>
-                <w:sz w:val="28"/>
-                <w:szCs w:val="28"/>
-                <w:lang w:val="en-US"/>
-              </w:rPr>
-              <w:t>.</w:t>
-            </w:r>
-          </w:p>
-        </w:tc>
-      </w:tr>
-      <w:tr>
-        <w:trPr>
-          <w:trHeight w:val="719"/>
-        </w:trPr>
-        <w:tc>
-          <w:tcPr>
-            <w:tcW w:w="5070" w:type="dxa"/>
-            <w:hideMark/>
-          </w:tcPr>
-          <w:p>
-            <w:pPr>
-              <w:spacing w:line="360" w:lineRule="auto"/>
-              <w:rPr>
-                <w:sz w:val="28"/>
-                <w:szCs w:val="28"/>
-              </w:rPr>
-            </w:pPr>
-            <w:r>
-              <w:rPr>
-                <w:sz w:val="28"/>
-                <w:szCs w:val="28"/>
-              </w:rPr>
-              <w:t xml:space="preserve">Руководитель: преподаватель </w:t>
-            </w:r>
-          </w:p>
-          <w:p>
-            <w:pPr>
-              <w:spacing w:line="360" w:lineRule="auto"/>
-              <w:rPr>
-                <w:sz w:val="28"/>
-                <w:szCs w:val="28"/>
-              </w:rPr>
-            </w:pPr>
-            <w:r>
-              <w:rPr>
-                <w:sz w:val="28"/>
-                <w:szCs w:val="28"/>
-              </w:rPr>
-              <w:t xml:space="preserve">Кафедры </w:t>
-            </w:r>
-            <w:proofErr w:type="spellStart"/>
-            <w:r>
-              <w:rPr>
-                <w:sz w:val="28"/>
-                <w:szCs w:val="28"/>
-              </w:rPr>
-              <w:t>ИиВТ</w:t>
-            </w:r>
-            <w:proofErr w:type="spellEnd"/>
-          </w:p>
-        </w:tc>
-        <w:tc>
-          <w:tcPr>
-            <w:tcW w:w="4677" w:type="dxa"/>
-            <w:hideMark/>
-          </w:tcPr>
-          <w:p>
-            <w:pPr>
-              <w:spacing w:line="360" w:lineRule="auto"/>
-              <w:rPr>
-                <w:sz w:val="28"/>
-                <w:szCs w:val="28"/>
-              </w:rPr>
-            </w:pPr>
-            <w:r>
-              <w:rPr>
-                <w:sz w:val="28"/>
-                <w:szCs w:val="28"/>
-              </w:rPr>
-              <w:t>_________________Махно А.С.</w:t>
-            </w:r>
-          </w:p>
-        </w:tc>
-      </w:tr>
-      <w:tr>
-        <w:trPr>
-          <w:trHeight w:val="383"/>
-        </w:trPr>
-        <w:tc>
-          <w:tcPr>
-            <w:tcW w:w="5070" w:type="dxa"/>
-            <w:hideMark/>
-          </w:tcPr>
-          <w:p>
-            <w:pPr>
-              <w:spacing w:line="360" w:lineRule="auto"/>
-              <w:rPr>
-                <w:sz w:val="28"/>
-                <w:szCs w:val="28"/>
-              </w:rPr>
-            </w:pPr>
-            <w:r>
-              <w:rPr>
-                <w:sz w:val="28"/>
-                <w:szCs w:val="28"/>
-              </w:rPr>
-              <w:t>Дата защиты_____________________</w:t>
-            </w:r>
-          </w:p>
-        </w:tc>
-        <w:tc>
-          <w:tcPr>
-            <w:tcW w:w="4677" w:type="dxa"/>
-          </w:tcPr>
-          <w:p>
-            <w:pPr>
-              <w:spacing w:line="360" w:lineRule="auto"/>
-              <w:rPr>
-                <w:sz w:val="28"/>
-                <w:szCs w:val="28"/>
-              </w:rPr>
-            </w:pPr>
-          </w:p>
-        </w:tc>
-      </w:tr>
-      <w:tr>
-        <w:tc>
-          <w:tcPr>
-            <w:tcW w:w="5070" w:type="dxa"/>
-            <w:hideMark/>
-          </w:tcPr>
-          <w:p>
-            <w:pPr>
-              <w:spacing w:line="360" w:lineRule="auto"/>
-              <w:rPr>
-                <w:sz w:val="28"/>
-                <w:szCs w:val="28"/>
-              </w:rPr>
-            </w:pPr>
-            <w:r>
-              <w:rPr>
-                <w:sz w:val="28"/>
-                <w:szCs w:val="28"/>
-              </w:rPr>
-              <w:t>Оценка _________________________</w:t>
-            </w:r>
-          </w:p>
-        </w:tc>
-        <w:tc>
-          <w:tcPr>
-            <w:tcW w:w="4677" w:type="dxa"/>
-          </w:tcPr>
-          <w:p>
-            <w:pPr>
-              <w:spacing w:line="360" w:lineRule="auto"/>
-              <w:rPr>
-                <w:sz w:val="28"/>
-                <w:szCs w:val="28"/>
-              </w:rPr>
-            </w:pPr>
-          </w:p>
-        </w:tc>
-      </w:tr>
-    </w:tbl>
-    <w:p>
-      <w:pPr>
-        <w:rPr>
-          <w:sz w:val="28"/>
-          <w:szCs w:val="28"/>
-        </w:rPr>
-      </w:pPr>
-    </w:p>
-    <w:p>
-      <w:pPr>
-        <w:rPr>
-          <w:sz w:val="28"/>
-          <w:szCs w:val="28"/>
-        </w:rPr>
-      </w:pPr>
-    </w:p>
-    <w:p>
-      <w:pPr>
-        <w:rPr>
-          <w:sz w:val="28"/>
-          <w:szCs w:val="28"/>
-        </w:rPr>
-      </w:pPr>
-    </w:p>
-    <w:p>
-      <w:pPr>
-        <w:rPr>
-          <w:sz w:val="28"/>
-          <w:szCs w:val="28"/>
-        </w:rPr>
-      </w:pPr>
-    </w:p>
-    <w:p>
-      <w:pPr>
-        <w:rPr>
-          <w:sz w:val="28"/>
-          <w:szCs w:val="28"/>
-        </w:rPr>
-      </w:pPr>
-    </w:p>
-    <w:p>
-      <w:pPr>
-        <w:rPr>
-          <w:sz w:val="28"/>
-          <w:szCs w:val="28"/>
-        </w:rPr>
-      </w:pPr>
-    </w:p>
-    <w:p>
-      <w:pPr>
-        <w:rPr>
-          <w:sz w:val="28"/>
-          <w:szCs w:val="28"/>
-        </w:rPr>
-      </w:pPr>
-    </w:p>
-    <w:p>
-      <w:pPr>
-        <w:rPr>
-          <w:sz w:val="28"/>
-          <w:szCs w:val="28"/>
-        </w:rPr>
-      </w:pPr>
-    </w:p>
-    <w:p>
-      <w:pPr>
-        <w:rPr>
-          <w:sz w:val="28"/>
-          <w:szCs w:val="28"/>
-        </w:rPr>
-      </w:pPr>
-    </w:p>
-    <w:p>
-      <w:pPr>
-        <w:rPr>
-          <w:sz w:val="28"/>
-          <w:szCs w:val="28"/>
-        </w:rPr>
-      </w:pPr>
-    </w:p>
-    <w:p>
-      <w:pPr>
-        <w:rPr>
-          <w:sz w:val="28"/>
-          <w:szCs w:val="28"/>
-        </w:rPr>
-      </w:pPr>
-    </w:p>
-    <w:p>
-      <w:pPr>
-        <w:rPr>
-          <w:sz w:val="28"/>
-          <w:szCs w:val="28"/>
-        </w:rPr>
-      </w:pPr>
-    </w:p>
-    <w:p>
-      <w:pPr>
-        <w:rPr>
-          <w:sz w:val="28"/>
-          <w:szCs w:val="28"/>
-        </w:rPr>
-      </w:pPr>
-    </w:p>
-    <w:p>
-      <w:pPr>
-        <w:jc w:val="center"/>
-        <w:rPr>
-          <w:sz w:val="28"/>
-          <w:szCs w:val="28"/>
-        </w:rPr>
-      </w:pPr>
-      <w:r>
-        <w:rPr>
-          <w:sz w:val="28"/>
-          <w:szCs w:val="28"/>
-        </w:rPr>
-        <w:t>Челябинск 2026 г.</w:t>
-      </w:r>
-    </w:p>
-    <w:p>
-      <w:pPr>
-        <w:jc w:val="center"/>
-        <w:rPr>
-          <w:sz w:val="28"/>
-          <w:szCs w:val="28"/>
-        </w:rPr>
-      </w:pPr>
-      <w:r>
-        <w:rPr>
-          <w:sz w:val="28"/>
-          <w:szCs w:val="28"/>
-        </w:rPr>
-        <w:lastRenderedPageBreak/>
         <w:t xml:space="preserve">Министерство образования и науки Челябинской области </w:t>
       </w:r>
       <w:r>
@@ -577,7 +83,21 @@
           <w:sz w:val="28"/>
           <w:szCs w:val="28"/>
         </w:rPr>
-        <w:t xml:space="preserve">Заведующий кафедры «Информатики и вычислительной техники» </w:t>
+        <w:t>Заведующ</w:t>
+      </w:r>
+      <w:r>
+        <w:rPr>
+          <w:sz w:val="28"/>
+          <w:szCs w:val="28"/>
+        </w:rPr>
+        <w:t>ая</w:t>
+      </w:r>
+      <w:r>
+        <w:rPr>
+          <w:sz w:val="28"/>
+          <w:szCs w:val="28"/>
+        </w:rPr>
+        <w:t xml:space="preserve"> кафедры «Информатики и вычислительной техники» </w:t>
       </w:r>
     </w:p>
     <w:p>
@@ -1132,6 +652,7 @@
                   <w:docPartUnique/>
                 </w:docPartObj>
               </w:sdtPr>
+              <w:sdtEndPr/>
               <w:sdtContent>
                 <w:sdt>
                   <w:sdtPr>
@@ -1148,6 +669,7 @@
                       <w:docPartUnique/>
                     </w:docPartObj>
                   </w:sdtPr>
+                  <w:sdtEndPr/>
                   <w:sdtContent>
                     <w:p>
                       <w:pPr>
@@ -3940,7 +3462,7 @@
         </w:rPr>
         <w:br w:type="page"/>
       </w:r>
-      <w:bookmarkStart w:id="1" w:name="_Toc231812943"/>
+      <w:bookmarkStart w:id="0" w:name="_Toc231812943"/>
       <w:r>
         <w:rPr>
           <w:rFonts w:cs="Times New Roman"/>
@@ -3950,7 +3472,7 @@
         <w:lastRenderedPageBreak/>
         <w:t>ВВЕДЕНИЕ</w:t>
       </w:r>
-      <w:bookmarkEnd w:id="1"/>
+      <w:bookmarkEnd w:id="0"/>
     </w:p>
     <w:p>
       <w:pPr>
@@ -4536,7 +4058,7 @@
           <w:szCs w:val="28"/>
         </w:rPr>
       </w:pPr>
-      <w:bookmarkStart w:id="2" w:name="_Toc231812944"/>
+      <w:bookmarkStart w:id="1" w:name="_Toc231812944"/>
       <w:r>
         <w:rPr>
           <w:rFonts w:cs="Times New Roman"/>
@@ -4546,7 +4068,7 @@
         <w:lastRenderedPageBreak/>
         <w:t>1 ТЕОРЕТИЧЕСКАЯ ЧАСТЬ</w:t>
       </w:r>
-      <w:bookmarkEnd w:id="2"/>
+      <w:bookmarkEnd w:id="1"/>
     </w:p>
     <w:p>
       <w:pPr>
@@ -4557,7 +4079,7 @@
           <w:szCs w:val="28"/>
         </w:rPr>
       </w:pPr>
-      <w:bookmarkStart w:id="3" w:name="_Toc231812945"/>
+      <w:bookmarkStart w:id="2" w:name="_Toc231812945"/>
       <w:r>
         <w:rPr>
           <w:rFonts w:cs="Times New Roman"/>
@@ -4565,7 +4087,7 @@
         </w:rPr>
         <w:t>1.1 Анализ предметной области и существующих аналогов</w:t>
       </w:r>
-      <w:bookmarkEnd w:id="3"/>
+      <w:bookmarkEnd w:id="2"/>
     </w:p>
     <w:p>
       <w:pPr>
@@ -5289,7 +4811,7 @@
           <w:szCs w:val="28"/>
         </w:rPr>
       </w:pPr>
-      <w:bookmarkStart w:id="4" w:name="_Toc231812946"/>
+      <w:bookmarkStart w:id="3" w:name="_Toc231812946"/>
       <w:r>
         <w:rPr>
           <w:rFonts w:cs="Times New Roman"/>
@@ -5298,7 +4820,7 @@
         <w:lastRenderedPageBreak/>
         <w:t>1.2 Психологические и педагогические основы VR-тренировки выступлений</w:t>
       </w:r>
-      <w:bookmarkEnd w:id="4"/>
+      <w:bookmarkEnd w:id="3"/>
     </w:p>
     <w:p>
       <w:pPr>
@@ -5434,7 +4956,7 @@
           <w:szCs w:val="28"/>
         </w:rPr>
       </w:pPr>
-      <w:bookmarkStart w:id="5" w:name="_Toc231812947"/>
+      <w:bookmarkStart w:id="4" w:name="_Toc231812947"/>
       <w:r>
         <w:rPr>
           <w:rFonts w:cs="Times New Roman"/>
@@ -5442,7 +4964,7 @@
         </w:rPr>
         <w:t>1.3 Обоснование выбора технологий и инструментов разработки</w:t>
       </w:r>
-      <w:bookmarkEnd w:id="5"/>
+      <w:bookmarkEnd w:id="4"/>
     </w:p>
     <w:p>
       <w:pPr>
@@ -6246,7 +5768,7 @@
           <w:szCs w:val="28"/>
         </w:rPr>
       </w:pPr>
-      <w:bookmarkStart w:id="6" w:name="_Toc231812948"/>
+      <w:bookmarkStart w:id="5" w:name="_Toc231812948"/>
       <w:r>
         <w:rPr>
           <w:rFonts w:cs="Times New Roman"/>
@@ -6256,7 +5778,7 @@
         <w:lastRenderedPageBreak/>
         <w:t>2 ПРАКТИЧЕСКАЯ ЧАСТЬ</w:t>
       </w:r>
-      <w:bookmarkEnd w:id="6"/>
+      <w:bookmarkEnd w:id="5"/>
     </w:p>
     <w:p>
       <w:pPr>
@@ -6267,7 +5789,7 @@
           <w:szCs w:val="28"/>
         </w:rPr>
       </w:pPr>
-      <w:bookmarkStart w:id="7" w:name="_Toc231812949"/>
+      <w:bookmarkStart w:id="6" w:name="_Toc231812949"/>
       <w:r>
         <w:rPr>
           <w:rFonts w:cs="Times New Roman"/>
@@ -6275,7 +5797,7 @@
         </w:rPr>
         <w:t>2.1 Проектирование функциональной структуры приложения</w:t>
       </w:r>
-      <w:bookmarkEnd w:id="7"/>
+      <w:bookmarkEnd w:id="6"/>
     </w:p>
     <w:p>
       <w:pPr>
@@ -7987,7 +7509,7 @@
           <w:szCs w:val="28"/>
         </w:rPr>
       </w:pPr>
-      <w:bookmarkStart w:id="8" w:name="_Toc231812950"/>
+      <w:bookmarkStart w:id="7" w:name="_Toc231812950"/>
       <w:r>
         <w:rPr>
           <w:rFonts w:cs="Times New Roman"/>
@@ -7995,7 +7517,7 @@
         </w:rPr>
         <w:t>2.2 Реализация VR-сцены и пользовательского взаимодействия</w:t>
       </w:r>
-      <w:bookmarkEnd w:id="8"/>
+      <w:bookmarkEnd w:id="7"/>
     </w:p>
     <w:p>
       <w:pPr>
@@ -8694,7 +8216,7 @@
           <w:szCs w:val="28"/>
         </w:rPr>
       </w:pPr>
-      <w:bookmarkStart w:id="9" w:name="_Toc231812951"/>
+      <w:bookmarkStart w:id="8" w:name="_Toc231812951"/>
       <w:r>
         <w:rPr>
           <w:rFonts w:cs="Times New Roman"/>
@@ -8702,7 +8224,7 @@
         </w:rPr>
         <w:t>2.3 Реализация меню, статистики, таймера и реакций аудитории</w:t>
       </w:r>
-      <w:bookmarkEnd w:id="9"/>
+      <w:bookmarkEnd w:id="8"/>
     </w:p>
     <w:p>
       <w:pPr>
@@ -9777,7 +9299,7 @@
           <w:szCs w:val="28"/>
         </w:rPr>
       </w:pPr>
-      <w:bookmarkStart w:id="10" w:name="_Toc231812952"/>
+      <w:bookmarkStart w:id="9" w:name="_Toc231812952"/>
       <w:r>
         <w:rPr>
           <w:rFonts w:cs="Times New Roman"/>
@@ -9785,7 +9307,7 @@
         </w:rPr>
         <w:t>2.4 Тестирование проекта</w:t>
       </w:r>
-      <w:bookmarkEnd w:id="10"/>
+      <w:bookmarkEnd w:id="9"/>
     </w:p>
     <w:p>
       <w:pPr>
@@ -11515,7 +11037,7 @@
           <w:szCs w:val="28"/>
         </w:rPr>
       </w:pPr>
-      <w:bookmarkStart w:id="11" w:name="_Toc231812953"/>
+      <w:bookmarkStart w:id="10" w:name="_Toc231812953"/>
       <w:r>
         <w:rPr>
           <w:rFonts w:cs="Times New Roman"/>
@@ -11523,7 +11045,7 @@
         </w:rPr>
         <w:t>2.5 Руководство программиста</w:t>
       </w:r>
-      <w:bookmarkEnd w:id="11"/>
+      <w:bookmarkEnd w:id="10"/>
     </w:p>
     <w:p>
       <w:pPr>
@@ -12782,7 +12304,7 @@
           <w:szCs w:val="28"/>
         </w:rPr>
       </w:pPr>
-      <w:bookmarkStart w:id="12" w:name="_Toc231812954"/>
+      <w:bookmarkStart w:id="11" w:name="_Toc231812954"/>
       <w:r>
         <w:rPr>
           <w:rFonts w:cs="Times New Roman"/>
@@ -12790,7 +12312,7 @@
         </w:rPr>
         <w:t>2.6 Руководство пользователя</w:t>
       </w:r>
-      <w:bookmarkEnd w:id="12"/>
+      <w:bookmarkEnd w:id="11"/>
     </w:p>
     <w:p>
       <w:pPr>
@@ -13874,7 +13396,7 @@
           <w:szCs w:val="28"/>
         </w:rPr>
       </w:pPr>
-      <w:bookmarkStart w:id="13" w:name="_Toc231812955"/>
+      <w:bookmarkStart w:id="12" w:name="_Toc231812955"/>
       <w:r>
         <w:rPr>
           <w:rFonts w:cs="Times New Roman"/>
@@ -13882,7 +13404,7 @@
         </w:rPr>
         <w:t>2.7 Экономическое обоснование проекта</w:t>
       </w:r>
-      <w:bookmarkEnd w:id="13"/>
+      <w:bookmarkEnd w:id="12"/>
     </w:p>
     <w:p>
       <w:pPr>
@@ -15166,7 +14688,7 @@
           <w:szCs w:val="28"/>
         </w:rPr>
       </w:pPr>
-      <w:bookmarkStart w:id="14" w:name="_Toc231812956"/>
+      <w:bookmarkStart w:id="13" w:name="_Toc231812956"/>
       <w:r>
         <w:rPr>
           <w:rFonts w:cs="Times New Roman"/>
@@ -15174,7 +14696,7 @@
         </w:rPr>
         <w:t>2.8 Техника безопасности и охрана труда</w:t>
       </w:r>
-      <w:bookmarkEnd w:id="14"/>
+      <w:bookmarkEnd w:id="13"/>
     </w:p>
     <w:p>
       <w:pPr>
@@ -15775,7 +15297,7 @@
           <w:szCs w:val="28"/>
         </w:rPr>
       </w:pPr>
-      <w:bookmarkStart w:id="15" w:name="_Toc231812957"/>
+      <w:bookmarkStart w:id="14" w:name="_Toc231812957"/>
       <w:r>
         <w:rPr>
           <w:rFonts w:cs="Times New Roman"/>
@@ -15784,7 +15306,7 @@
         <w:lastRenderedPageBreak/>
         <w:t>2.9 Ограничения прототипа и направления дальнейшего развития</w:t>
       </w:r>
-      <w:bookmarkEnd w:id="15"/>
+      <w:bookmarkEnd w:id="14"/>
     </w:p>
     <w:p>
       <w:pPr>
@@ -16018,7 +15540,7 @@
           <w:szCs w:val="28"/>
         </w:rPr>
       </w:pPr>
-      <w:bookmarkStart w:id="16" w:name="_Toc231812958"/>
+      <w:bookmarkStart w:id="15" w:name="_Toc231812958"/>
       <w:r>
         <w:rPr>
           <w:rFonts w:cs="Times New Roman"/>
@@ -16026,7 +15548,7 @@
         </w:rPr>
         <w:t>2.10 Трассировка требований и реализованных функций</w:t>
       </w:r>
-      <w:bookmarkEnd w:id="16"/>
+      <w:bookmarkEnd w:id="15"/>
     </w:p>
     <w:p>
       <w:pPr>
@@ -16998,7 +16520,7 @@
           <w:szCs w:val="28"/>
         </w:rPr>
       </w:pPr>
-      <w:bookmarkStart w:id="17" w:name="_Toc231812959"/>
+      <w:bookmarkStart w:id="16" w:name="_Toc231812959"/>
       <w:r>
         <w:rPr>
           <w:rFonts w:cs="Times New Roman"/>
@@ -17006,7 +16528,7 @@
         </w:rPr>
         <w:t>2.11 Оценка оригинальности проектных решений</w:t>
       </w:r>
-      <w:bookmarkEnd w:id="17"/>
+      <w:bookmarkEnd w:id="16"/>
     </w:p>
     <w:p>
       <w:pPr>
@@ -17238,7 +16760,7 @@
           <w:szCs w:val="28"/>
         </w:rPr>
       </w:pPr>
-      <w:bookmarkStart w:id="18" w:name="_Toc231812960"/>
+      <w:bookmarkStart w:id="17" w:name="_Toc231812960"/>
       <w:r>
         <w:rPr>
           <w:rFonts w:cs="Times New Roman"/>
@@ -17246,7 +16768,7 @@
         </w:rPr>
         <w:t>2.12 Выводы по практической части</w:t>
       </w:r>
-      <w:bookmarkEnd w:id="18"/>
+      <w:bookmarkEnd w:id="17"/>
     </w:p>
     <w:p>
       <w:pPr>
@@ -17449,7 +16971,7 @@
           <w:szCs w:val="28"/>
         </w:rPr>
       </w:pPr>
-      <w:bookmarkStart w:id="19" w:name="_Toc231812961"/>
+      <w:bookmarkStart w:id="18" w:name="_Toc231812961"/>
       <w:r>
         <w:rPr>
           <w:rFonts w:eastAsia="Times New Roman" w:cs="Times New Roman"/>
@@ -17458,7 +16980,7 @@
         <w:lastRenderedPageBreak/>
         <w:t>2.13 Детализация жизненного цикла тренировки</w:t>
       </w:r>
-      <w:bookmarkEnd w:id="19"/>
+      <w:bookmarkEnd w:id="18"/>
     </w:p>
     <w:p>
       <w:pPr>
@@ -17678,7 +17200,7 @@
           <w:szCs w:val="28"/>
         </w:rPr>
       </w:pPr>
-      <w:bookmarkStart w:id="20" w:name="_Toc231812962"/>
+      <w:bookmarkStart w:id="19" w:name="_Toc231812962"/>
       <w:r>
         <w:rPr>
           <w:rFonts w:eastAsia="Times New Roman" w:cs="Times New Roman"/>
@@ -17686,7 +17208,7 @@
         </w:rPr>
         <w:t>2.14 Подробное описание пользовательских сценариев</w:t>
       </w:r>
-      <w:bookmarkEnd w:id="20"/>
+      <w:bookmarkEnd w:id="19"/>
     </w:p>
     <w:p>
       <w:pPr>
@@ -17990,7 +17512,7 @@
           <w:szCs w:val="28"/>
         </w:rPr>
       </w:pPr>
-      <w:bookmarkStart w:id="21" w:name="_Toc231812963"/>
+      <w:bookmarkStart w:id="20" w:name="_Toc231812963"/>
       <w:r>
         <w:rPr>
           <w:rFonts w:eastAsia="Times New Roman" w:cs="Times New Roman"/>
@@ -17998,7 +17520,7 @@
         </w:rPr>
         <w:t>2.15 Алгоритмы работы основных модулей</w:t>
       </w:r>
-      <w:bookmarkEnd w:id="21"/>
+      <w:bookmarkEnd w:id="20"/>
     </w:p>
     <w:p>
       <w:pPr>
@@ -18465,7 +17987,7 @@
           <w:szCs w:val="28"/>
         </w:rPr>
       </w:pPr>
-      <w:bookmarkStart w:id="22" w:name="_Toc231812964"/>
+      <w:bookmarkStart w:id="21" w:name="_Toc231812964"/>
       <w:r>
         <w:rPr>
           <w:rFonts w:eastAsia="Times New Roman" w:cs="Times New Roman"/>
@@ -18473,7 +17995,7 @@
         </w:rPr>
         <w:t>2.16 Методика проверки качества пользовательского опыта</w:t>
       </w:r>
-      <w:bookmarkEnd w:id="22"/>
+      <w:bookmarkEnd w:id="21"/>
     </w:p>
     <w:p>
       <w:pPr>
@@ -18737,7 +18259,7 @@
           <w:szCs w:val="28"/>
         </w:rPr>
       </w:pPr>
-      <w:bookmarkStart w:id="23" w:name="_Toc231812965"/>
+      <w:bookmarkStart w:id="22" w:name="_Toc231812965"/>
       <w:r>
         <w:rPr>
           <w:rFonts w:eastAsia="Times New Roman" w:cs="Times New Roman"/>
@@ -18745,7 +18267,7 @@
         </w:rPr>
         <w:t>2.17 Расширенная программа тестирования</w:t>
       </w:r>
-      <w:bookmarkEnd w:id="23"/>
+      <w:bookmarkEnd w:id="22"/>
     </w:p>
     <w:p>
       <w:pPr>
@@ -19557,7 +19079,7 @@
           <w:szCs w:val="28"/>
         </w:rPr>
       </w:pPr>
-      <w:bookmarkStart w:id="24" w:name="_Toc231812966"/>
+      <w:bookmarkStart w:id="23" w:name="_Toc231812966"/>
       <w:r>
         <w:rPr>
           <w:rFonts w:eastAsia="Times New Roman" w:cs="Times New Roman"/>
@@ -19565,7 +19087,7 @@
         </w:rPr>
         <w:t>2.18 Организация внедрения в учебный процесс</w:t>
       </w:r>
-      <w:bookmarkEnd w:id="24"/>
+      <w:bookmarkEnd w:id="23"/>
     </w:p>
     <w:p>
       <w:pPr>
@@ -19809,7 +19331,7 @@
           <w:szCs w:val="28"/>
         </w:rPr>
       </w:pPr>
-      <w:bookmarkStart w:id="25" w:name="_Toc231812967"/>
+      <w:bookmarkStart w:id="24" w:name="_Toc231812967"/>
       <w:r>
         <w:rPr>
           <w:rFonts w:eastAsia="Times New Roman" w:cs="Times New Roman"/>
@@ -19817,7 +19339,7 @@
         </w:rPr>
         <w:t>2.19 Риски проекта и способы их снижения</w:t>
       </w:r>
-      <w:bookmarkEnd w:id="25"/>
+      <w:bookmarkEnd w:id="24"/>
     </w:p>
     <w:p>
       <w:pPr>
@@ -20823,7 +20345,7 @@
           <w:szCs w:val="28"/>
         </w:rPr>
       </w:pPr>
-      <w:bookmarkStart w:id="26" w:name="_Toc231812968"/>
+      <w:bookmarkStart w:id="25" w:name="_Toc231812968"/>
       <w:r>
         <w:rPr>
           <w:rFonts w:eastAsia="Times New Roman" w:cs="Times New Roman"/>
@@ -20831,7 +20353,7 @@
         </w:rPr>
         <w:t>2.20 Перспективная архитектура следующей версии</w:t>
       </w:r>
-      <w:bookmarkEnd w:id="26"/>
+      <w:bookmarkEnd w:id="25"/>
     </w:p>
     <w:p>
       <w:pPr>
@@ -21217,7 +20739,7 @@
           <w:szCs w:val="28"/>
         </w:rPr>
       </w:pPr>
-      <w:bookmarkStart w:id="27" w:name="_Toc231812969"/>
+      <w:bookmarkStart w:id="26" w:name="_Toc231812969"/>
       <w:r>
         <w:rPr>
           <w:rFonts w:eastAsia="Times New Roman" w:cs="Times New Roman"/>
@@ -21225,7 +20747,7 @@
         </w:rPr>
         <w:t>2.21 Модель данных тренировочной сессии</w:t>
       </w:r>
-      <w:bookmarkEnd w:id="27"/>
+      <w:bookmarkEnd w:id="26"/>
     </w:p>
     <w:p>
       <w:pPr>
@@ -22035,7 +21557,7 @@
           <w:szCs w:val="28"/>
         </w:rPr>
       </w:pPr>
-      <w:bookmarkStart w:id="28" w:name="_Toc231812970"/>
+      <w:bookmarkStart w:id="27" w:name="_Toc231812970"/>
       <w:r>
         <w:rPr>
           <w:rFonts w:eastAsia="Times New Roman" w:cs="Times New Roman"/>
@@ -22044,7 +21566,7 @@
         <w:lastRenderedPageBreak/>
         <w:t>2.22 Обоснование решений интерфейса</w:t>
       </w:r>
-      <w:bookmarkEnd w:id="28"/>
+      <w:bookmarkEnd w:id="27"/>
     </w:p>
     <w:p>
       <w:pPr>
@@ -22314,7 +21836,7 @@
           <w:szCs w:val="28"/>
         </w:rPr>
       </w:pPr>
-      <w:bookmarkStart w:id="29" w:name="_Toc231812971"/>
+      <w:bookmarkStart w:id="28" w:name="_Toc231812971"/>
       <w:r>
         <w:rPr>
           <w:rFonts w:eastAsia="Times New Roman" w:cs="Times New Roman"/>
@@ -22347,7 +21869,7 @@
         </w:rPr>
         <w:t>Unity</w:t>
       </w:r>
-      <w:bookmarkEnd w:id="29"/>
+      <w:bookmarkEnd w:id="28"/>
       <w:proofErr w:type="spellEnd"/>
     </w:p>
     <w:p>
@@ -22837,7 +22359,7 @@
           <w:szCs w:val="28"/>
         </w:rPr>
       </w:pPr>
-      <w:bookmarkStart w:id="30" w:name="_Toc231812972"/>
+      <w:bookmarkStart w:id="29" w:name="_Toc231812972"/>
       <w:r>
         <w:rPr>
           <w:rFonts w:eastAsia="Times New Roman" w:cs="Times New Roman"/>
@@ -22853,7 +22375,7 @@
         </w:rPr>
         <w:t>сопровождаемость</w:t>
       </w:r>
-      <w:bookmarkEnd w:id="30"/>
+      <w:bookmarkEnd w:id="29"/>
       <w:proofErr w:type="spellEnd"/>
     </w:p>
     <w:p>
@@ -23296,7 +22818,7 @@
           <w:szCs w:val="28"/>
         </w:rPr>
       </w:pPr>
-      <w:bookmarkStart w:id="31" w:name="_Toc231812973"/>
+      <w:bookmarkStart w:id="30" w:name="_Toc231812973"/>
       <w:r>
         <w:rPr>
           <w:rFonts w:eastAsia="Times New Roman" w:cs="Times New Roman"/>
@@ -23304,7 +22826,7 @@
         </w:rPr>
         <w:t>2.25 Подготовка демонстрации для защиты</w:t>
       </w:r>
-      <w:bookmarkEnd w:id="31"/>
+      <w:bookmarkEnd w:id="30"/>
     </w:p>
     <w:p>
       <w:pPr>
@@ -24084,7 +23606,7 @@
           <w:szCs w:val="28"/>
         </w:rPr>
       </w:pPr>
-      <w:bookmarkStart w:id="32" w:name="_Toc231812974"/>
+      <w:bookmarkStart w:id="31" w:name="_Toc231812974"/>
       <w:r>
         <w:rPr>
           <w:rFonts w:eastAsia="Times New Roman" w:cs="Times New Roman"/>
@@ -24092,7 +23614,7 @@
         </w:rPr>
         <w:t>2.26 Расширенное руководство по эксплуатации</w:t>
       </w:r>
-      <w:bookmarkEnd w:id="32"/>
+      <w:bookmarkEnd w:id="31"/>
     </w:p>
     <w:p>
       <w:pPr>
@@ -24570,7 +24092,7 @@
           <w:szCs w:val="28"/>
         </w:rPr>
       </w:pPr>
-      <w:bookmarkStart w:id="33" w:name="_Toc231812975"/>
+      <w:bookmarkStart w:id="32" w:name="_Toc231812975"/>
       <w:r>
         <w:rPr>
           <w:rFonts w:cs="Times New Roman"/>
@@ -24579,7 +24101,7 @@
         </w:rPr>
         <w:t>ЗАКЛЮЧЕНИЕ</w:t>
       </w:r>
-      <w:bookmarkEnd w:id="33"/>
+      <w:bookmarkEnd w:id="32"/>
     </w:p>
     <w:p>
       <w:pPr>
@@ -24830,7 +24352,7 @@
           <w:szCs w:val="28"/>
         </w:rPr>
       </w:pPr>
-      <w:bookmarkStart w:id="34" w:name="_Toc231812976"/>
+      <w:bookmarkStart w:id="33" w:name="_Toc231812976"/>
       <w:r>
         <w:rPr>
           <w:rFonts w:cs="Times New Roman"/>
@@ -24840,7 +24362,7 @@
         <w:lastRenderedPageBreak/>
         <w:t>СПИСОК ИСПОЛЬЗОВАННЫХ ИСТОЧНИКОВ</w:t>
       </w:r>
-      <w:bookmarkEnd w:id="34"/>
+      <w:bookmarkEnd w:id="33"/>
     </w:p>
     <w:p>
       <w:pPr>
@@ -25680,7 +25202,7 @@
           <w:szCs w:val="28"/>
         </w:rPr>
       </w:pPr>
-      <w:bookmarkStart w:id="35" w:name="_Toc231812977"/>
+      <w:bookmarkStart w:id="34" w:name="_Toc231812977"/>
       <w:r>
         <w:rPr>
           <w:rFonts w:cs="Times New Roman"/>
@@ -25690,7 +25212,7 @@
         <w:lastRenderedPageBreak/>
         <w:t>ПРИЛОЖЕНИЕ А</w:t>
       </w:r>
-      <w:bookmarkEnd w:id="35"/>
+      <w:bookmarkEnd w:id="34"/>
     </w:p>
     <w:p>
       <w:pPr>
@@ -26261,7 +25783,7 @@
           <w:szCs w:val="28"/>
         </w:rPr>
       </w:pPr>
-      <w:bookmarkStart w:id="36" w:name="_Toc231812978"/>
+      <w:bookmarkStart w:id="35" w:name="_Toc231812978"/>
       <w:r>
         <w:rPr>
           <w:rFonts w:cs="Times New Roman"/>
@@ -26271,7 +25793,7 @@
         <w:lastRenderedPageBreak/>
         <w:t>ПРИЛОЖЕНИЕ Б</w:t>
       </w:r>
-      <w:bookmarkEnd w:id="36"/>
+      <w:bookmarkEnd w:id="35"/>
     </w:p>
     <w:p>
       <w:pPr>
@@ -26987,7 +26509,7 @@
           <w:szCs w:val="28"/>
         </w:rPr>
       </w:pPr>
-      <w:bookmarkStart w:id="37" w:name="_Toc231812979"/>
+      <w:bookmarkStart w:id="36" w:name="_Toc231812979"/>
       <w:r>
         <w:rPr>
           <w:rFonts w:cs="Times New Roman"/>
@@ -26997,7 +26519,7 @@
         <w:lastRenderedPageBreak/>
         <w:t>ПРИЛОЖЕНИЕ В</w:t>
       </w:r>
-      <w:bookmarkEnd w:id="37"/>
+      <w:bookmarkEnd w:id="36"/>
     </w:p>
     <w:p>
       <w:pPr>
@@ -27109,7 +26631,7 @@
           <w:szCs w:val="28"/>
         </w:rPr>
       </w:pPr>
-      <w:bookmarkStart w:id="38" w:name="_Toc231812980"/>
+      <w:bookmarkStart w:id="37" w:name="_Toc231812980"/>
       <w:r>
         <w:rPr>
           <w:rStyle w:val="a5"/>
@@ -27122,7 +26644,7 @@
         <w:lastRenderedPageBreak/>
         <w:t>СПИСОК ЛИТЕРАТУРЫ</w:t>
       </w:r>
-      <w:bookmarkEnd w:id="38"/>
+      <w:bookmarkEnd w:id="37"/>
     </w:p>
     <w:p>
       <w:pPr>
@@ -32770,13 +32292,7 @@
                                 <w:rPr>
                                   <w:sz w:val="18"/>
                                 </w:rPr>
-                                <w:t xml:space="preserve"> </w:t>
-                              </w:r>
-                              <w:r>
-                                <w:rPr>
-                                  <w:sz w:val="18"/>
-                                </w:rPr>
-                                <w:t>Н. Контр.</w:t>
+                                <w:t xml:space="preserve"> Н. Контр.</w:t>
                               </w:r>
                             </w:p>
                           </w:txbxContent>
@@ -33757,13 +33273,7 @@
                           <w:rPr>
                             <w:sz w:val="18"/>
                           </w:rPr>
-                          <w:t xml:space="preserve"> </w:t>
-                        </w:r>
-                        <w:r>
-                          <w:rPr>
-                            <w:sz w:val="18"/>
-                          </w:rPr>
-                          <w:t>Н. Контр.</w:t>
+                          <w:t xml:space="preserve"> Н. Контр.</w:t>
                         </w:r>
                       </w:p>
                     </w:txbxContent>
@@ -47675,10 +47185,6 @@
 </file>
 
 <file path=customXml/item1.xml><?xml version="1.0" encoding="utf-8"?>
-<b:Sources xmlns:b="http://schemas.openxmlformats.org/officeDocument/2006/bibliography" xmlns="http://schemas.openxmlformats.org/officeDocument/2006/bibliography" SelectedStyle="\APASixthEditionOfficeOnline.xsl" StyleName="APA" Version="6"/>
-</file>
-
-<file path=customXml/item2.xml><?xml version="1.0" encoding="utf-8"?>
 <s:customData xmlns="http://www.wps.cn/officeDocument/2013/wpsCustomData" xmlns:s="http://www.wps.cn/officeDocument/2013/wpsCustomData">
   <customSectProps>
     <customSectPr/>
@@ -47690,18 +47196,22 @@
 </s:customData>
 </file>
 
+<file path=customXml/item2.xml><?xml version="1.0" encoding="utf-8"?>
+<b:Sources xmlns:b="http://schemas.openxmlformats.org/officeDocument/2006/bibliography" xmlns="http://schemas.openxmlformats.org/officeDocument/2006/bibliography" SelectedStyle="\APASixthEditionOfficeOnline.xsl" StyleName="APA" Version="6"/>
+</file>
+
 <file path=customXml/itemProps1.xml><?xml version="1.0" encoding="utf-8"?>
+<ds:datastoreItem xmlns:ds="http://schemas.openxmlformats.org/officeDocument/2006/customXml" ds:itemID="{B1977F7D-205B-4081-913C-38D41E755F92}">
+  <ds:schemaRefs>
+    <ds:schemaRef ds:uri="http://www.wps.cn/officeDocument/2013/wpsCustomData"/>
+  </ds:schemaRefs>
+</ds:datastoreItem>
+</file>
+
+<file path=customXml/itemProps2.xml><?xml version="1.0" encoding="utf-8"?>
 <ds:datastoreItem xmlns:ds="http://schemas.openxmlformats.org/officeDocument/2006/customXml" ds:itemID="{B9B7208A-8458-4E51-A263-3C8FE53C5AAB}">
   <ds:schemaRefs>
     <ds:schemaRef ds:uri="http://schemas.openxmlformats.org/officeDocument/2006/bibliography"/>
   </ds:schemaRefs>
 </ds:datastoreItem>
-</file>
-
-<file path=customXml/itemProps2.xml><?xml version="1.0" encoding="utf-8"?>
-<ds:datastoreItem xmlns:ds="http://schemas.openxmlformats.org/officeDocument/2006/customXml" ds:itemID="{B1977F7D-205B-4081-913C-38D41E755F92}">
-  <ds:schemaRefs>
-    <ds:schemaRef ds:uri="http://www.wps.cn/officeDocument/2013/wpsCustomData"/>
-  </ds:schemaRefs>
-</ds:datastoreItem>
 </file>
</xml_diff>